<commit_message>
Contrato (Fabrica): horario de trabalho puxado da escala do empregado (nao mais fixo 44h)
Bug reportado: doc 'Contrato de trabalho com confidencialidade, LGPD e tempo de
contribuicao' saia sempre com horario padrao (44h fixo no template), ignorando o
horario cadastrado na admissao.

- Template .docx: paragrafo da jornada vira token {{HORARIO_TRABALHO}}.
- catalogo.json: novo campo HORARIO_TRABALHO (origem empregado), editavel.
- jornada.ts: helper jornadaTexto/jornadaDoEmpregado compartilhado (extraido do
  ContratosTrabalho, sem duplicar).
- DocumentosPage: preenche HORARIO_TRABALHO com a jornada real (emp.workSchedules,
  importada da admissao); fallback = jornada padrao 44h quando sem escala.
- Validado: token substituido pelo horario real no docx gerado.

Co-Authored-By: Claude Opus 4.8 <noreply@anthropic.com>
</commit_message>
<xml_diff>
--- a/api/_docrh/modelos/contrato-trabalho-confidencialidade-aposentadoria.docx
+++ b/api/_docrh/modelos/contrato-trabalho-confidencialidade-aposentadoria.docx
@@ -627,7 +627,7 @@
                 <w:szCs w:val="22"/>
                 <w:highlight w:val="yellow"/>
               </w:rPr>
-              <w:t>08:00 às 12:00 e das 13:00 às 17:48 horas</w:t>
+              <w:t>{{HORARIO_TRABALHO}}</w:t>
             </w:r>
             <w:r>
               <w:rPr>
@@ -636,7 +636,6 @@
                 <w:sz w:val="22"/>
                 <w:szCs w:val="22"/>
               </w:rPr>
-              <w:t xml:space="preserve">, de segunda a sexta feira, com 01 (uma) hora de intervalo de refeição/repouso, perfazendo um total de 44 (quarenta e quatro) horas de trabalho </w:t>
             </w:r>
             <w:commentRangeStart w:id="2"/>
             <w:r>
@@ -646,14 +645,12 @@
                 <w:sz w:val="22"/>
                 <w:szCs w:val="22"/>
               </w:rPr>
-              <w:t>semanais</w:t>
             </w:r>
             <w:commentRangeEnd w:id="2"/>
             <w:r>
               <w:rPr>
                 <w:rStyle w:val="Refdecomentrio"/>
               </w:rPr>
-              <w:commentReference w:id="2"/>
             </w:r>
             <w:r>
               <w:rPr>
@@ -662,7 +659,6 @@
                 <w:sz w:val="22"/>
                 <w:szCs w:val="22"/>
               </w:rPr>
-              <w:t>.</w:t>
             </w:r>
           </w:p>
           <w:p>

</xml_diff>